<commit_message>
court(lactapp): petition-for-writ regenerated on the current model; latex XENG passes, cross_engine gate, docx reported (footnote URL after a digit slash) (fb-595.54.58)
Co-Authored-By: Claude Opus 5.5 <noreply@anthropic.com>
</commit_message>
<xml_diff>
--- a/courts/fifth-circuit/louisiana/state/court-of-appeal/petition-for-writ/usage/OUTPUT-petition-for-writ.docx
+++ b/courts/fifth-circuit/louisiana/state/court-of-appeal/petition-for-writ/usage/OUTPUT-petition-for-writ.docx
@@ -1571,10 +1571,7 @@
         <w:ind w:left="1140" w:right="720" w:hanging="720"/>
       </w:pPr>
       <w:r>
-        <w:t xml:space="preserve">I.</w:t>
-      </w:r>
-      <w:r>
-        <w:t xml:space="preserve"> </w:t>
+        <w:t xml:space="preserve">I. </w:t>
       </w:r>
       <w:r>
         <w:t xml:space="preserve">Relevant</w:t>
@@ -1611,10 +1608,7 @@
         <w:ind w:left="1140" w:right="720" w:hanging="720"/>
       </w:pPr>
       <w:r>
-        <w:t xml:space="preserve">II.</w:t>
-      </w:r>
-      <w:r>
-        <w:t xml:space="preserve"> </w:t>
+        <w:t xml:space="preserve">II. </w:t>
       </w:r>
       <w:r>
         <w:t xml:space="preserve">CGI’s</w:t>
@@ -1687,10 +1681,7 @@
         <w:ind w:left="1140" w:right="720" w:hanging="720"/>
       </w:pPr>
       <w:r>
-        <w:t xml:space="preserve">III.</w:t>
-      </w:r>
-      <w:r>
-        <w:t xml:space="preserve"> </w:t>
+        <w:t xml:space="preserve">III. </w:t>
       </w:r>
       <w:r>
         <w:t xml:space="preserve">The</w:t>
@@ -1795,10 +1786,7 @@
         <w:ind w:left="1140" w:right="720" w:hanging="720"/>
       </w:pPr>
       <w:r>
-        <w:t xml:space="preserve">I.</w:t>
-      </w:r>
-      <w:r>
-        <w:t xml:space="preserve"> </w:t>
+        <w:t xml:space="preserve">I. </w:t>
       </w:r>
       <w:r>
         <w:t xml:space="preserve">This</w:t>
@@ -1877,10 +1865,7 @@
         <w:ind w:left="1560" w:right="720" w:hanging="720"/>
       </w:pPr>
       <w:r>
-        <w:t xml:space="preserve">A.</w:t>
-      </w:r>
-      <w:r>
-        <w:t xml:space="preserve"> </w:t>
+        <w:t xml:space="preserve">A. </w:t>
       </w:r>
       <w:r>
         <w:t xml:space="preserve">The</w:t>
@@ -1959,10 +1944,7 @@
         <w:ind w:left="1560" w:right="720" w:hanging="720"/>
       </w:pPr>
       <w:r>
-        <w:t xml:space="preserve">B.</w:t>
-      </w:r>
-      <w:r>
-        <w:t xml:space="preserve"> </w:t>
+        <w:t xml:space="preserve">B. </w:t>
       </w:r>
       <w:r>
         <w:t xml:space="preserve">A</w:t>
@@ -2101,10 +2083,7 @@
         <w:ind w:left="1560" w:right="720" w:hanging="720"/>
       </w:pPr>
       <w:r>
-        <w:t xml:space="preserve">C.</w:t>
-      </w:r>
-      <w:r>
-        <w:t xml:space="preserve"> </w:t>
+        <w:t xml:space="preserve">C. </w:t>
       </w:r>
       <w:r>
         <w:t xml:space="preserve">A</w:t>
@@ -2245,10 +2224,7 @@
         <w:ind w:left="1140" w:right="720" w:hanging="720"/>
       </w:pPr>
       <w:r>
-        <w:t xml:space="preserve">II.</w:t>
-      </w:r>
-      <w:r>
-        <w:t xml:space="preserve"> </w:t>
+        <w:t xml:space="preserve">II. </w:t>
       </w:r>
       <w:r>
         <w:t xml:space="preserve">CGI</w:t>
@@ -2393,10 +2369,7 @@
         <w:ind w:left="1560" w:right="720" w:hanging="720"/>
       </w:pPr>
       <w:r>
-        <w:t xml:space="preserve">A.</w:t>
-      </w:r>
-      <w:r>
-        <w:t xml:space="preserve"> </w:t>
+        <w:t xml:space="preserve">A. </w:t>
       </w:r>
       <w:r>
         <w:t xml:space="preserve">The</w:t>
@@ -2511,10 +2484,7 @@
         <w:ind w:left="1560" w:right="720" w:hanging="720"/>
       </w:pPr>
       <w:r>
-        <w:t xml:space="preserve">B.</w:t>
-      </w:r>
-      <w:r>
-        <w:t xml:space="preserve"> </w:t>
+        <w:t xml:space="preserve">B. </w:t>
       </w:r>
       <w:r>
         <w:t xml:space="preserve">The</w:t>
@@ -5873,6 +5843,10 @@
         <w:t xml:space="preserve">I.</w:t>
       </w:r>
       <w:r>
+        <w:rPr>
+          <w:b/>
+          <w:bCs/>
+        </w:rPr>
         <w:tab/>
       </w:r>
       <w:r>
@@ -6097,6 +6071,10 @@
         <w:t xml:space="preserve">II.</w:t>
       </w:r>
       <w:r>
+        <w:rPr>
+          <w:b/>
+          <w:bCs/>
+        </w:rPr>
         <w:tab/>
       </w:r>
       <w:r>
@@ -6379,6 +6357,10 @@
         <w:t xml:space="preserve">III.</w:t>
       </w:r>
       <w:r>
+        <w:rPr>
+          <w:b/>
+          <w:bCs/>
+        </w:rPr>
         <w:tab/>
       </w:r>
       <w:r>
@@ -6530,7 +6512,7 @@
         <w:pStyle w:val="XdQuoteOnly"/>
       </w:pPr>
       <w:r>
-        <w:t xml:space="preserve">Counsel: And I am not even going there, Your Honor. I believe the specific factual procedural status of this case dictated that the kind of discovery that we need to flesh this out was not opportune. These exceptions and summary judgments were filed, I believe March/​April. We had a hearing divvying up in May, no one’s problem. That was continued until today. Your Honor issued an order staying all discovery with the exception of that related to the pending exception, summary judgment. There has been no production of documents other than insurance policies . . . .</w:t>
+        <w:t xml:space="preserve">Counsel: And I am not even going there, Your Honor. I believe the specific factual procedural status of this case dictated that the kind of discovery that we need to flesh this out was not opportune. These exceptions and summary judgments were filed, I believe March/​April. We had a hearing divvying up in May, no one’s problem. That was continued until today. Your Honor issued an order staying all discovery with the exception of that related to the pending exception, summary judgment. There has been no production of documents other than insurance policies . . . .</w:t>
       </w:r>
     </w:p>
     <w:p>
@@ -6789,6 +6771,10 @@
         <w:t xml:space="preserve">I.</w:t>
       </w:r>
       <w:r>
+        <w:rPr>
+          <w:b/>
+          <w:bCs/>
+        </w:rPr>
         <w:tab/>
       </w:r>
       <w:r>
@@ -6941,6 +6927,10 @@
         <w:t xml:space="preserve">A.</w:t>
       </w:r>
       <w:r>
+        <w:rPr>
+          <w:b/>
+          <w:bCs/>
+        </w:rPr>
         <w:tab/>
       </w:r>
       <w:r>
@@ -7191,6 +7181,10 @@
         <w:t xml:space="preserve">B.</w:t>
       </w:r>
       <w:r>
+        <w:rPr>
+          <w:b/>
+          <w:bCs/>
+        </w:rPr>
         <w:tab/>
       </w:r>
       <w:r>
@@ -7502,7 +7496,7 @@
         <w:pStyle w:val="XdQuoteOnly"/>
       </w:pPr>
       <w:r>
-        <w:t xml:space="preserve">The requirement that a summary judgment should be considered only after “adequate discovery” has been construed to mean that there is no absolute right to delay action on a summary judgment motion until discovery is complete; rather, the requirement is only that parties have a fair opportunity to carry out discovery and to present their claim. Unless plaintiff shows a probable injustice a suit should not be delayed pending discovery when it appears at an early stage that there is no genuine issue of fact. . . . The mere contention of an opponent that he lacks sufficient information to defend a motion for summary judgment because of movant’s failure to comply with discovery is insufficient to defeat the motion.</w:t>
+        <w:t xml:space="preserve">The requirement that a summary judgment should be considered only after “adequate discovery” has been construed to mean that there is no absolute right to delay action on a summary judgment motion until discovery is complete; rather, the requirement is only that parties have a fair opportunity to carry out discovery and to present their claim. Unless plaintiff shows a probable injustice a suit should not be delayed pending discovery when it appears at an early stage that there is no genuine issue of fact. . . . The mere contention of an opponent that he lacks sufficient information to defend a motion for summary judgment because of movant’s failure to comply with discovery is insufficient to defeat the motion.</w:t>
       </w:r>
     </w:p>
     <w:p>
@@ -7775,6 +7769,10 @@
         <w:t xml:space="preserve">C.</w:t>
       </w:r>
       <w:r>
+        <w:rPr>
+          <w:b/>
+          <w:bCs/>
+        </w:rPr>
         <w:tab/>
       </w:r>
       <w:r>
@@ -8209,6 +8207,10 @@
         <w:t xml:space="preserve">II.</w:t>
       </w:r>
       <w:r>
+        <w:rPr>
+          <w:b/>
+          <w:bCs/>
+        </w:rPr>
         <w:tab/>
       </w:r>
       <w:r>
@@ -8523,6 +8525,10 @@
         <w:t xml:space="preserve">A.</w:t>
       </w:r>
       <w:r>
+        <w:rPr>
+          <w:b/>
+          <w:bCs/>
+        </w:rPr>
         <w:tab/>
       </w:r>
       <w:r>
@@ -9008,6 +9014,10 @@
         <w:t xml:space="preserve">B.</w:t>
       </w:r>
       <w:r>
+        <w:rPr>
+          <w:b/>
+          <w:bCs/>
+        </w:rPr>
         <w:tab/>
       </w:r>
       <w:r>
@@ -14112,7 +14122,7 @@
         <w:t xml:space="preserve"> </w:t>
       </w:r>
       <w:r>
-        <w:t xml:space="preserve">The Release provides, “For the convenience of LAHC, the Original Agreement shall terminate on April 30, 2014. CGI shall continue to perform the Delegated Functions through April 30, 2014, to be followed by a six month wind-down period as specified in Section 2.5 of the Original Agreement. For the six month wind-down period, CGI shall provide such wind-down services as the parties may agree in a wind-down plan, all in accordance with Sections 2.5 and 2.5.1 of the Original Agreement. . . . The general scope and structure of the wind down period is as specified in Attachment 1 to this Letter Agreement.” Writ Attachment 4 at R</w:t>
+        <w:t xml:space="preserve">The Release provides, “For the convenience of LAHC, the Original Agreement shall terminate on April 30, 2014. CGI shall continue to perform the Delegated Functions through April 30, 2014, to be followed by a six month wind-down period as specified in Section 2.5 of the Original Agreement. For the six month wind-down period, CGI shall provide such wind-down services as the parties may agree in a wind-down plan, all in accordance with Sections 2.5 and 2.5.1 of the Original Agreement. . . . The general scope and structure of the wind down period is as specified in Attachment 1 to this Letter Agreement.” Writ Attachment 4 at R</w:t>
       </w:r>
       <w:r>
         <w:noBreakHyphen/>
@@ -14231,7 +14241,7 @@
         <w:t xml:space="preserve">See, e.g.</w:t>
       </w:r>
       <w:r>
-        <w:t xml:space="preserve">, “Obamacare’s Co-Op Disaster: Only 7 Remain,” FORBES MAGAZINE, July 25, 2016, accessed at https://​​www.​forbes.​com/​​sites/​​sallypipes/​​2016/​​07/​​25/​​obamacares-​co-​op-​disaster-​an-​unfunny-​comedy-​of-​errors/​​#71abdcab5d5b; “Two more Obamacare health insurance plans collapse,” THE WASHINGTON POST, October 16, 2015, accessed at https://​​www.​washingtonpost.​com/​​national/​​health-​science/​​two-​more-​obamacare-​health-​insurance-​plans-​collapse/​​2015/​​10/​​16/​​cc324fd0</w:t>
+        <w:t xml:space="preserve">, “Obamacare’s Co-Op Disaster: Only 7 Remain,” FORBES MAGAZINE, July 25, 2016, accessed at https://​www.​forbes.​com/​sites/​sallypipes/​2016/​07/​25/​obamacares-​co-​op-​disaster-​an-​unfunny-​comedy-​of-​errors/​#71abdcab5d5b; “Two more Obamacare health insurance plans collapse,” THE WASHINGTON POST, October 16, 2015, accessed at https://​www.​washingtonpost.​com/​national/​health-​science/​two-​more-​obamacare-​health-​insurance-​plans-​collapse/​2015/​10/​16/​cc324fd0</w:t>
       </w:r>
       <w:r>
         <w:noBreakHyphen/>
@@ -14255,7 +14265,7 @@
         <w:noBreakHyphen/>
       </w:r>
       <w:r>
-        <w:t xml:space="preserve">0af317ed58c9_story.​html?utm_term=.​319c1183a7e7.</w:t>
+        <w:t xml:space="preserve">0af317ed58c9_story.​html?​utm_term=.​319c1183a7e7.</w:t>
       </w:r>
     </w:p>
   </w:footnote>
@@ -14286,13 +14296,7 @@
         <w:noBreakHyphen/>
       </w:r>
       <w:r>
-        <w:t xml:space="preserve">23 (Receiver’s Petition, ¶¶ 41</w:t>
-      </w:r>
-      <w:r>
-        <w:noBreakHyphen/>
-      </w:r>
-      <w:r>
-        <w:t xml:space="preserve">44) (“LAHC and CGI entered into an Administrative Services Agreement (‘Agreement’) whereby CGI agreed to perform certain administrative and management services . . . . CGI breached its obligations and warranties set forth in the Agreement in a grossly negligent manner.”).</w:t>
+        <w:t xml:space="preserve">23 (Receiver’s Petition, ¶¶ 41-⁠44) (“LAHC and CGI entered into an Administrative Services Agreement (‘Agreement’) whereby CGI agreed to perform certain administrative and management services . . . . CGI breached its obligations and warranties set forth in the Agreement in a grossly negligent manner.”).</w:t>
       </w:r>
     </w:p>
   </w:footnote>
@@ -15509,6 +15513,33 @@
       <w:ind w:left="2160" w:hanging="720"/>
     </w:pPr>
   </w:style>
+  <w:style w:type="paragraph" w:customStyle="1" w:styleId="XdQuoteList1">
+    <w:name w:val="Xd Quote List 1"/>
+    <w:basedOn w:val="Normal"/>
+    <w:qFormat/>
+    <w:pPr>
+      <w:spacing w:before="0" w:after="0" w:line="322" w:lineRule="exact"/>
+      <w:ind w:left="1440" w:right="720" w:hanging="720"/>
+    </w:pPr>
+  </w:style>
+  <w:style w:type="paragraph" w:customStyle="1" w:styleId="XdQuoteList2">
+    <w:name w:val="Xd Quote List 2"/>
+    <w:basedOn w:val="Normal"/>
+    <w:qFormat/>
+    <w:pPr>
+      <w:spacing w:before="0" w:after="0" w:line="322" w:lineRule="exact"/>
+      <w:ind w:left="2160" w:right="720" w:hanging="720"/>
+    </w:pPr>
+  </w:style>
+  <w:style w:type="paragraph" w:customStyle="1" w:styleId="XdQuoteList3">
+    <w:name w:val="Xd Quote List 3"/>
+    <w:basedOn w:val="Normal"/>
+    <w:qFormat/>
+    <w:pPr>
+      <w:spacing w:before="0" w:after="0" w:line="322" w:lineRule="exact"/>
+      <w:ind w:left="2880" w:right="720" w:hanging="720"/>
+    </w:pPr>
+  </w:style>
   <w:style w:type="paragraph" w:customStyle="1" w:styleId="XdQuote">
     <w:name w:val="XdQuote"/>
     <w:basedOn w:val="BodyText"/>

</xml_diff>